<commit_message>
Elimina resumen_presentacion y limpia referencias documentales
</commit_message>
<xml_diff>
--- a/documentacion/docx/documentacion_detallada.docx
+++ b/documentacion/docx/documentacion_detallada.docx
@@ -2656,7 +2656,6 @@
         <w:rPr>
           <w:lang w:val="es-CR"/>
         </w:rPr>
-        <w:t>el material local de presentación, cuando corresponda</w:t>
       </w:r>
     </w:p>
     <w:p>
@@ -2747,13 +2746,12 @@
         <w:rPr>
           <w:lang w:val="es-CR"/>
         </w:rPr>
-        <w:t>Esta regla mantiene la c</w:t>
-      </w:r>
-      <w:r>
-        <w:rPr>
-          <w:lang w:val="es-CR"/>
-        </w:rPr>
-        <w:t>onsistencia entre el análisis reproducible, la documentación formal y los materiales de presentación del proyecto.</w:t>
+        <w:t>Esta regla mantiene la consistencia entre el análisis reproducible, la documentación formal y los materiales asociados al proyecto.</w:t>
+      </w:r>
+      <w:r>
+        <w:rPr>
+          <w:lang w:val="es-CR"/>
+        </w:rPr>
       </w:r>
     </w:p>
     <w:sectPr>

</xml_diff>